<commit_message>
Add September 2026 Illinois IRP workshop learning guide
</commit_message>
<xml_diff>
--- a/Ameren_Illinois_Energy_Policy_Learning_Guide.docx
+++ b/Ameren_Illinois_Energy_Policy_Learning_Guide.docx
@@ -6125,6 +6125,918 @@
       </w:pPr>
       <w:r>
         <w:t>Long-term planning and real-time operations are two ends of the same chain. The IRP asks what resources should be available in future years. A MISO emergency reveals what happens when available supply, imports, transmission, weather, and demand become tight today.</w:t>
+      </w:r>
+    </w:p>
+    <w:p>
+      <w:pPr>
+        <w:pStyle w:val="Heading2"/>
+        <w:keepNext/>
+        <w:keepLines/>
+      </w:pPr>
+      <w:r>
+        <w:t>September 24 IRP workshop and the two CEJA scenarios</w:t>
+      </w:r>
+    </w:p>
+    <w:p>
+      <w:pPr>
+        <w:keepLines/>
+      </w:pPr>
+      <w:r>
+        <w:t>The fifth state workshop presented preliminary modeling, not a decision to extend a plant. It compared a Reference Case using current CEJA retirement assumptions with a CEJA Extension Case in which affected units remain available longer while observing interim emissions limits. The two cases help isolate the reliability value of keeping existing capacity on the system.</w:t>
+      </w:r>
+    </w:p>
+    <w:p>
+      <w:pPr>
+        <w:pStyle w:val="Heading3"/>
+        <w:keepNext/>
+        <w:keepLines/>
+      </w:pPr>
+      <w:r>
+        <w:t>The central distinction</w:t>
+      </w:r>
+    </w:p>
+    <w:p>
+      <w:pPr>
+        <w:keepLines/>
+      </w:pPr>
+      <w:r>
+        <w:t>Think of a backup generator at a building. It may run only a few hours a year, yet it matters on the day the primary supply falls short. A gas peaker can have the same kind of capacity value. The extension scenario lets the model keep that backup available. The reference scenario makes the model find replacement dependable capacity when covered units retire.</w:t>
+      </w:r>
+    </w:p>
+    <w:tbl>
+      <w:tblPr>
+        <w:tblStyle w:val="TableGrid"/>
+        <w:tblW w:type="auto" w:w="0"/>
+        <w:jc w:val="center"/>
+        <w:tblLayout w:type="fixed"/>
+        <w:tblLook w:firstColumn="1" w:firstRow="1" w:lastColumn="0" w:lastRow="0" w:noHBand="0" w:noVBand="1" w:val="04A0"/>
+      </w:tblPr>
+      <w:tblGrid>
+        <w:gridCol w:w="3389"/>
+        <w:gridCol w:w="3389"/>
+        <w:gridCol w:w="3389"/>
+      </w:tblGrid>
+      <w:tr>
+        <w:trPr>
+          <w:cantSplit/>
+          <w:tblHeader w:val="true"/>
+        </w:trPr>
+        <w:tc>
+          <w:tcPr>
+            <w:tcW w:type="dxa" w:w="1728"/>
+            <w:vAlign w:val="center"/>
+            <w:shd w:fill="DCEAF2"/>
+            <w:tcMar>
+              <w:top w:w="90" w:type="dxa"/>
+              <w:left w:w="90" w:type="dxa"/>
+              <w:bottom w:w="90" w:type="dxa"/>
+              <w:right w:w="90" w:type="dxa"/>
+            </w:tcMar>
+            <w:tcBorders>
+              <w:top w:val="single" w:sz="4" w:color="D9D9D9"/>
+              <w:left w:val="single" w:sz="4" w:color="D9D9D9"/>
+              <w:bottom w:val="single" w:sz="4" w:color="D9D9D9"/>
+              <w:right w:val="single" w:sz="4" w:color="D9D9D9"/>
+              <w:insideH w:val="single" w:sz="4" w:color="D9D9D9"/>
+              <w:insideV w:val="single" w:sz="4" w:color="D9D9D9"/>
+            </w:tcBorders>
+          </w:tcPr>
+          <w:p>
+            <w:pPr>
+              <w:spacing w:after="40" w:before="40"/>
+            </w:pPr>
+            <w:r>
+              <w:rPr>
+                <w:b/>
+                <w:sz w:val="17"/>
+              </w:rPr>
+              <w:t>Question</w:t>
+            </w:r>
+          </w:p>
+        </w:tc>
+        <w:tc>
+          <w:tcPr>
+            <w:tcW w:type="dxa" w:w="3672"/>
+            <w:vAlign w:val="center"/>
+            <w:shd w:fill="DCEAF2"/>
+            <w:tcMar>
+              <w:top w:w="90" w:type="dxa"/>
+              <w:left w:w="90" w:type="dxa"/>
+              <w:bottom w:w="90" w:type="dxa"/>
+              <w:right w:w="90" w:type="dxa"/>
+            </w:tcMar>
+            <w:tcBorders>
+              <w:top w:val="single" w:sz="4" w:color="D9D9D9"/>
+              <w:left w:val="single" w:sz="4" w:color="D9D9D9"/>
+              <w:bottom w:val="single" w:sz="4" w:color="D9D9D9"/>
+              <w:right w:val="single" w:sz="4" w:color="D9D9D9"/>
+              <w:insideH w:val="single" w:sz="4" w:color="D9D9D9"/>
+              <w:insideV w:val="single" w:sz="4" w:color="D9D9D9"/>
+            </w:tcBorders>
+          </w:tcPr>
+          <w:p>
+            <w:pPr>
+              <w:spacing w:after="40" w:before="40"/>
+            </w:pPr>
+            <w:r>
+              <w:rPr>
+                <w:b/>
+                <w:sz w:val="17"/>
+              </w:rPr>
+              <w:t>Reference Case</w:t>
+            </w:r>
+          </w:p>
+        </w:tc>
+        <w:tc>
+          <w:tcPr>
+            <w:tcW w:type="dxa" w:w="3672"/>
+            <w:vAlign w:val="center"/>
+            <w:shd w:fill="DCEAF2"/>
+            <w:tcMar>
+              <w:top w:w="90" w:type="dxa"/>
+              <w:left w:w="90" w:type="dxa"/>
+              <w:bottom w:w="90" w:type="dxa"/>
+              <w:right w:w="90" w:type="dxa"/>
+            </w:tcMar>
+            <w:tcBorders>
+              <w:top w:val="single" w:sz="4" w:color="D9D9D9"/>
+              <w:left w:val="single" w:sz="4" w:color="D9D9D9"/>
+              <w:bottom w:val="single" w:sz="4" w:color="D9D9D9"/>
+              <w:right w:val="single" w:sz="4" w:color="D9D9D9"/>
+              <w:insideH w:val="single" w:sz="4" w:color="D9D9D9"/>
+              <w:insideV w:val="single" w:sz="4" w:color="D9D9D9"/>
+            </w:tcBorders>
+          </w:tcPr>
+          <w:p>
+            <w:pPr>
+              <w:spacing w:after="40" w:before="40"/>
+            </w:pPr>
+            <w:r>
+              <w:rPr>
+                <w:b/>
+                <w:sz w:val="17"/>
+              </w:rPr>
+              <w:t>CEJA Extension Case</w:t>
+            </w:r>
+          </w:p>
+        </w:tc>
+      </w:tr>
+      <w:tr>
+        <w:trPr>
+          <w:cantSplit/>
+        </w:trPr>
+        <w:tc>
+          <w:tcPr>
+            <w:tcW w:type="dxa" w:w="1728"/>
+            <w:vAlign w:val="center"/>
+            <w:shd w:fill="FFFFFF"/>
+            <w:tcMar>
+              <w:top w:w="90" w:type="dxa"/>
+              <w:left w:w="90" w:type="dxa"/>
+              <w:bottom w:w="90" w:type="dxa"/>
+              <w:right w:w="90" w:type="dxa"/>
+            </w:tcMar>
+            <w:tcBorders>
+              <w:top w:val="single" w:sz="4" w:color="D9D9D9"/>
+              <w:left w:val="single" w:sz="4" w:color="D9D9D9"/>
+              <w:bottom w:val="single" w:sz="4" w:color="D9D9D9"/>
+              <w:right w:val="single" w:sz="4" w:color="D9D9D9"/>
+              <w:insideH w:val="single" w:sz="4" w:color="D9D9D9"/>
+              <w:insideV w:val="single" w:sz="4" w:color="D9D9D9"/>
+            </w:tcBorders>
+          </w:tcPr>
+          <w:p>
+            <w:pPr>
+              <w:spacing w:after="40" w:before="40"/>
+            </w:pPr>
+            <w:r>
+              <w:rPr>
+                <w:sz w:val="17"/>
+              </w:rPr>
+              <w:t>Existing units</w:t>
+            </w:r>
+          </w:p>
+        </w:tc>
+        <w:tc>
+          <w:tcPr>
+            <w:tcW w:type="dxa" w:w="3672"/>
+            <w:vAlign w:val="center"/>
+            <w:shd w:fill="FFFFFF"/>
+            <w:tcMar>
+              <w:top w:w="90" w:type="dxa"/>
+              <w:left w:w="90" w:type="dxa"/>
+              <w:bottom w:w="90" w:type="dxa"/>
+              <w:right w:w="90" w:type="dxa"/>
+            </w:tcMar>
+            <w:tcBorders>
+              <w:top w:val="single" w:sz="4" w:color="D9D9D9"/>
+              <w:left w:val="single" w:sz="4" w:color="D9D9D9"/>
+              <w:bottom w:val="single" w:sz="4" w:color="D9D9D9"/>
+              <w:right w:val="single" w:sz="4" w:color="D9D9D9"/>
+              <w:insideH w:val="single" w:sz="4" w:color="D9D9D9"/>
+              <w:insideV w:val="single" w:sz="4" w:color="D9D9D9"/>
+            </w:tcBorders>
+          </w:tcPr>
+          <w:p>
+            <w:pPr>
+              <w:spacing w:after="40" w:before="40"/>
+            </w:pPr>
+            <w:r>
+              <w:rPr>
+                <w:sz w:val="17"/>
+              </w:rPr>
+              <w:t>Retire under modeled current-policy assumptions, with specified updates.</w:t>
+            </w:r>
+          </w:p>
+        </w:tc>
+        <w:tc>
+          <w:tcPr>
+            <w:tcW w:type="dxa" w:w="3672"/>
+            <w:vAlign w:val="center"/>
+            <w:shd w:fill="FFFFFF"/>
+            <w:tcMar>
+              <w:top w:w="90" w:type="dxa"/>
+              <w:left w:w="90" w:type="dxa"/>
+              <w:bottom w:w="90" w:type="dxa"/>
+              <w:right w:w="90" w:type="dxa"/>
+            </w:tcMar>
+            <w:tcBorders>
+              <w:top w:val="single" w:sz="4" w:color="D9D9D9"/>
+              <w:left w:val="single" w:sz="4" w:color="D9D9D9"/>
+              <w:bottom w:val="single" w:sz="4" w:color="D9D9D9"/>
+              <w:right w:val="single" w:sz="4" w:color="D9D9D9"/>
+              <w:insideH w:val="single" w:sz="4" w:color="D9D9D9"/>
+              <w:insideV w:val="single" w:sz="4" w:color="D9D9D9"/>
+            </w:tcBorders>
+          </w:tcPr>
+          <w:p>
+            <w:pPr>
+              <w:spacing w:after="40" w:before="40"/>
+            </w:pPr>
+            <w:r>
+              <w:rPr>
+                <w:sz w:val="17"/>
+              </w:rPr>
+              <w:t>Remain available longer while meeting interim emissions reductions.</w:t>
+            </w:r>
+          </w:p>
+        </w:tc>
+      </w:tr>
+      <w:tr>
+        <w:trPr>
+          <w:cantSplit/>
+        </w:trPr>
+        <w:tc>
+          <w:tcPr>
+            <w:tcW w:type="dxa" w:w="1728"/>
+            <w:vAlign w:val="center"/>
+            <w:shd w:fill="F6F9FC"/>
+            <w:tcMar>
+              <w:top w:w="90" w:type="dxa"/>
+              <w:left w:w="90" w:type="dxa"/>
+              <w:bottom w:w="90" w:type="dxa"/>
+              <w:right w:w="90" w:type="dxa"/>
+            </w:tcMar>
+            <w:tcBorders>
+              <w:top w:val="single" w:sz="4" w:color="D9D9D9"/>
+              <w:left w:val="single" w:sz="4" w:color="D9D9D9"/>
+              <w:bottom w:val="single" w:sz="4" w:color="D9D9D9"/>
+              <w:right w:val="single" w:sz="4" w:color="D9D9D9"/>
+              <w:insideH w:val="single" w:sz="4" w:color="D9D9D9"/>
+              <w:insideV w:val="single" w:sz="4" w:color="D9D9D9"/>
+            </w:tcBorders>
+          </w:tcPr>
+          <w:p>
+            <w:pPr>
+              <w:spacing w:after="40" w:before="40"/>
+            </w:pPr>
+            <w:r>
+              <w:rPr>
+                <w:sz w:val="17"/>
+              </w:rPr>
+              <w:t>Firm capacity</w:t>
+            </w:r>
+          </w:p>
+        </w:tc>
+        <w:tc>
+          <w:tcPr>
+            <w:tcW w:type="dxa" w:w="3672"/>
+            <w:vAlign w:val="center"/>
+            <w:shd w:fill="F6F9FC"/>
+            <w:tcMar>
+              <w:top w:w="90" w:type="dxa"/>
+              <w:left w:w="90" w:type="dxa"/>
+              <w:bottom w:w="90" w:type="dxa"/>
+              <w:right w:w="90" w:type="dxa"/>
+            </w:tcMar>
+            <w:tcBorders>
+              <w:top w:val="single" w:sz="4" w:color="D9D9D9"/>
+              <w:left w:val="single" w:sz="4" w:color="D9D9D9"/>
+              <w:bottom w:val="single" w:sz="4" w:color="D9D9D9"/>
+              <w:right w:val="single" w:sz="4" w:color="D9D9D9"/>
+              <w:insideH w:val="single" w:sz="4" w:color="D9D9D9"/>
+              <w:insideV w:val="single" w:sz="4" w:color="D9D9D9"/>
+            </w:tcBorders>
+          </w:tcPr>
+          <w:p>
+            <w:pPr>
+              <w:spacing w:after="40" w:before="40"/>
+            </w:pPr>
+            <w:r>
+              <w:rPr>
+                <w:sz w:val="17"/>
+              </w:rPr>
+              <w:t>More new firm resources and out-of-state capacity are selected as units retire.</w:t>
+            </w:r>
+          </w:p>
+        </w:tc>
+        <w:tc>
+          <w:tcPr>
+            <w:tcW w:type="dxa" w:w="3672"/>
+            <w:vAlign w:val="center"/>
+            <w:shd w:fill="F6F9FC"/>
+            <w:tcMar>
+              <w:top w:w="90" w:type="dxa"/>
+              <w:left w:w="90" w:type="dxa"/>
+              <w:bottom w:w="90" w:type="dxa"/>
+              <w:right w:w="90" w:type="dxa"/>
+            </w:tcMar>
+            <w:tcBorders>
+              <w:top w:val="single" w:sz="4" w:color="D9D9D9"/>
+              <w:left w:val="single" w:sz="4" w:color="D9D9D9"/>
+              <w:bottom w:val="single" w:sz="4" w:color="D9D9D9"/>
+              <w:right w:val="single" w:sz="4" w:color="D9D9D9"/>
+              <w:insideH w:val="single" w:sz="4" w:color="D9D9D9"/>
+              <w:insideV w:val="single" w:sz="4" w:color="D9D9D9"/>
+            </w:tcBorders>
+          </w:tcPr>
+          <w:p>
+            <w:pPr>
+              <w:spacing w:after="40" w:before="40"/>
+            </w:pPr>
+            <w:r>
+              <w:rPr>
+                <w:sz w:val="17"/>
+              </w:rPr>
+              <w:t>Existing units provide some dependable MW, so fewer replacement resources are selected.</w:t>
+            </w:r>
+          </w:p>
+        </w:tc>
+      </w:tr>
+      <w:tr>
+        <w:trPr>
+          <w:cantSplit/>
+        </w:trPr>
+        <w:tc>
+          <w:tcPr>
+            <w:tcW w:type="dxa" w:w="1728"/>
+            <w:vAlign w:val="center"/>
+            <w:shd w:fill="FFFFFF"/>
+            <w:tcMar>
+              <w:top w:w="90" w:type="dxa"/>
+              <w:left w:w="90" w:type="dxa"/>
+              <w:bottom w:w="90" w:type="dxa"/>
+              <w:right w:w="90" w:type="dxa"/>
+            </w:tcMar>
+            <w:tcBorders>
+              <w:top w:val="single" w:sz="4" w:color="D9D9D9"/>
+              <w:left w:val="single" w:sz="4" w:color="D9D9D9"/>
+              <w:bottom w:val="single" w:sz="4" w:color="D9D9D9"/>
+              <w:right w:val="single" w:sz="4" w:color="D9D9D9"/>
+              <w:insideH w:val="single" w:sz="4" w:color="D9D9D9"/>
+              <w:insideV w:val="single" w:sz="4" w:color="D9D9D9"/>
+            </w:tcBorders>
+          </w:tcPr>
+          <w:p>
+            <w:pPr>
+              <w:spacing w:after="40" w:before="40"/>
+            </w:pPr>
+            <w:r>
+              <w:rPr>
+                <w:sz w:val="17"/>
+              </w:rPr>
+              <w:t>Renewables and storage</w:t>
+            </w:r>
+          </w:p>
+        </w:tc>
+        <w:tc>
+          <w:tcPr>
+            <w:tcW w:type="dxa" w:w="3672"/>
+            <w:vAlign w:val="center"/>
+            <w:shd w:fill="FFFFFF"/>
+            <w:tcMar>
+              <w:top w:w="90" w:type="dxa"/>
+              <w:left w:w="90" w:type="dxa"/>
+              <w:bottom w:w="90" w:type="dxa"/>
+              <w:right w:w="90" w:type="dxa"/>
+            </w:tcMar>
+            <w:tcBorders>
+              <w:top w:val="single" w:sz="4" w:color="D9D9D9"/>
+              <w:left w:val="single" w:sz="4" w:color="D9D9D9"/>
+              <w:bottom w:val="single" w:sz="4" w:color="D9D9D9"/>
+              <w:right w:val="single" w:sz="4" w:color="D9D9D9"/>
+              <w:insideH w:val="single" w:sz="4" w:color="D9D9D9"/>
+              <w:insideV w:val="single" w:sz="4" w:color="D9D9D9"/>
+            </w:tcBorders>
+          </w:tcPr>
+          <w:p>
+            <w:pPr>
+              <w:spacing w:after="40" w:before="40"/>
+            </w:pPr>
+            <w:r>
+              <w:rPr>
+                <w:sz w:val="17"/>
+              </w:rPr>
+              <w:t>Major additions continue.</w:t>
+            </w:r>
+          </w:p>
+        </w:tc>
+        <w:tc>
+          <w:tcPr>
+            <w:tcW w:type="dxa" w:w="3672"/>
+            <w:vAlign w:val="center"/>
+            <w:shd w:fill="FFFFFF"/>
+            <w:tcMar>
+              <w:top w:w="90" w:type="dxa"/>
+              <w:left w:w="90" w:type="dxa"/>
+              <w:bottom w:w="90" w:type="dxa"/>
+              <w:right w:w="90" w:type="dxa"/>
+            </w:tcMar>
+            <w:tcBorders>
+              <w:top w:val="single" w:sz="4" w:color="D9D9D9"/>
+              <w:left w:val="single" w:sz="4" w:color="D9D9D9"/>
+              <w:bottom w:val="single" w:sz="4" w:color="D9D9D9"/>
+              <w:right w:val="single" w:sz="4" w:color="D9D9D9"/>
+              <w:insideH w:val="single" w:sz="4" w:color="D9D9D9"/>
+              <w:insideV w:val="single" w:sz="4" w:color="D9D9D9"/>
+            </w:tcBorders>
+          </w:tcPr>
+          <w:p>
+            <w:pPr>
+              <w:spacing w:after="40" w:before="40"/>
+            </w:pPr>
+            <w:r>
+              <w:rPr>
+                <w:sz w:val="17"/>
+              </w:rPr>
+              <w:t>Major additions still continue; extensions do not remove the need to build.</w:t>
+            </w:r>
+          </w:p>
+        </w:tc>
+      </w:tr>
+      <w:tr>
+        <w:trPr>
+          <w:cantSplit/>
+        </w:trPr>
+        <w:tc>
+          <w:tcPr>
+            <w:tcW w:type="dxa" w:w="1728"/>
+            <w:vAlign w:val="center"/>
+            <w:shd w:fill="F6F9FC"/>
+            <w:tcMar>
+              <w:top w:w="90" w:type="dxa"/>
+              <w:left w:w="90" w:type="dxa"/>
+              <w:bottom w:w="90" w:type="dxa"/>
+              <w:right w:w="90" w:type="dxa"/>
+            </w:tcMar>
+            <w:tcBorders>
+              <w:top w:val="single" w:sz="4" w:color="D9D9D9"/>
+              <w:left w:val="single" w:sz="4" w:color="D9D9D9"/>
+              <w:bottom w:val="single" w:sz="4" w:color="D9D9D9"/>
+              <w:right w:val="single" w:sz="4" w:color="D9D9D9"/>
+              <w:insideH w:val="single" w:sz="4" w:color="D9D9D9"/>
+              <w:insideV w:val="single" w:sz="4" w:color="D9D9D9"/>
+            </w:tcBorders>
+          </w:tcPr>
+          <w:p>
+            <w:pPr>
+              <w:spacing w:after="40" w:before="40"/>
+            </w:pPr>
+            <w:r>
+              <w:rPr>
+                <w:sz w:val="17"/>
+              </w:rPr>
+              <w:t>Operation</w:t>
+            </w:r>
+          </w:p>
+        </w:tc>
+        <w:tc>
+          <w:tcPr>
+            <w:tcW w:type="dxa" w:w="3672"/>
+            <w:vAlign w:val="center"/>
+            <w:shd w:fill="F6F9FC"/>
+            <w:tcMar>
+              <w:top w:w="90" w:type="dxa"/>
+              <w:left w:w="90" w:type="dxa"/>
+              <w:bottom w:w="90" w:type="dxa"/>
+              <w:right w:w="90" w:type="dxa"/>
+            </w:tcMar>
+            <w:tcBorders>
+              <w:top w:val="single" w:sz="4" w:color="D9D9D9"/>
+              <w:left w:val="single" w:sz="4" w:color="D9D9D9"/>
+              <w:bottom w:val="single" w:sz="4" w:color="D9D9D9"/>
+              <w:right w:val="single" w:sz="4" w:color="D9D9D9"/>
+              <w:insideH w:val="single" w:sz="4" w:color="D9D9D9"/>
+              <w:insideV w:val="single" w:sz="4" w:color="D9D9D9"/>
+            </w:tcBorders>
+          </w:tcPr>
+          <w:p>
+            <w:pPr>
+              <w:spacing w:after="40" w:before="40"/>
+            </w:pPr>
+            <w:r>
+              <w:rPr>
+                <w:sz w:val="17"/>
+              </w:rPr>
+              <w:t>Retired units no longer generate.</w:t>
+            </w:r>
+          </w:p>
+        </w:tc>
+        <w:tc>
+          <w:tcPr>
+            <w:tcW w:type="dxa" w:w="3672"/>
+            <w:vAlign w:val="center"/>
+            <w:shd w:fill="F6F9FC"/>
+            <w:tcMar>
+              <w:top w:w="90" w:type="dxa"/>
+              <w:left w:w="90" w:type="dxa"/>
+              <w:bottom w:w="90" w:type="dxa"/>
+              <w:right w:w="90" w:type="dxa"/>
+            </w:tcMar>
+            <w:tcBorders>
+              <w:top w:val="single" w:sz="4" w:color="D9D9D9"/>
+              <w:left w:val="single" w:sz="4" w:color="D9D9D9"/>
+              <w:bottom w:val="single" w:sz="4" w:color="D9D9D9"/>
+              <w:right w:val="single" w:sz="4" w:color="D9D9D9"/>
+              <w:insideH w:val="single" w:sz="4" w:color="D9D9D9"/>
+              <w:insideV w:val="single" w:sz="4" w:color="D9D9D9"/>
+            </w:tcBorders>
+          </w:tcPr>
+          <w:p>
+            <w:pPr>
+              <w:spacing w:after="40" w:before="40"/>
+            </w:pPr>
+            <w:r>
+              <w:rPr>
+                <w:sz w:val="17"/>
+              </w:rPr>
+              <w:t>Retained gas units provide capacity while generating relatively infrequently.</w:t>
+            </w:r>
+          </w:p>
+        </w:tc>
+      </w:tr>
+      <w:tr>
+        <w:trPr>
+          <w:cantSplit/>
+        </w:trPr>
+        <w:tc>
+          <w:tcPr>
+            <w:tcW w:type="dxa" w:w="1728"/>
+            <w:vAlign w:val="center"/>
+            <w:shd w:fill="FFFFFF"/>
+            <w:tcMar>
+              <w:top w:w="90" w:type="dxa"/>
+              <w:left w:w="90" w:type="dxa"/>
+              <w:bottom w:w="90" w:type="dxa"/>
+              <w:right w:w="90" w:type="dxa"/>
+            </w:tcMar>
+            <w:tcBorders>
+              <w:top w:val="single" w:sz="4" w:color="D9D9D9"/>
+              <w:left w:val="single" w:sz="4" w:color="D9D9D9"/>
+              <w:bottom w:val="single" w:sz="4" w:color="D9D9D9"/>
+              <w:right w:val="single" w:sz="4" w:color="D9D9D9"/>
+              <w:insideH w:val="single" w:sz="4" w:color="D9D9D9"/>
+              <w:insideV w:val="single" w:sz="4" w:color="D9D9D9"/>
+            </w:tcBorders>
+          </w:tcPr>
+          <w:p>
+            <w:pPr>
+              <w:spacing w:after="40" w:before="40"/>
+            </w:pPr>
+            <w:r>
+              <w:rPr>
+                <w:sz w:val="17"/>
+              </w:rPr>
+              <w:t>Clean in-state generation in 2045</w:t>
+            </w:r>
+          </w:p>
+        </w:tc>
+        <w:tc>
+          <w:tcPr>
+            <w:tcW w:type="dxa" w:w="3672"/>
+            <w:vAlign w:val="center"/>
+            <w:shd w:fill="FFFFFF"/>
+            <w:tcMar>
+              <w:top w:w="90" w:type="dxa"/>
+              <w:left w:w="90" w:type="dxa"/>
+              <w:bottom w:w="90" w:type="dxa"/>
+              <w:right w:w="90" w:type="dxa"/>
+            </w:tcMar>
+            <w:tcBorders>
+              <w:top w:val="single" w:sz="4" w:color="D9D9D9"/>
+              <w:left w:val="single" w:sz="4" w:color="D9D9D9"/>
+              <w:bottom w:val="single" w:sz="4" w:color="D9D9D9"/>
+              <w:right w:val="single" w:sz="4" w:color="D9D9D9"/>
+              <w:insideH w:val="single" w:sz="4" w:color="D9D9D9"/>
+              <w:insideV w:val="single" w:sz="4" w:color="D9D9D9"/>
+            </w:tcBorders>
+          </w:tcPr>
+          <w:p>
+            <w:pPr>
+              <w:spacing w:after="40" w:before="40"/>
+            </w:pPr>
+            <w:r>
+              <w:rPr>
+                <w:sz w:val="17"/>
+              </w:rPr>
+              <w:t>About 99.9% under the slide deck measure.</w:t>
+            </w:r>
+          </w:p>
+        </w:tc>
+        <w:tc>
+          <w:tcPr>
+            <w:tcW w:type="dxa" w:w="3672"/>
+            <w:vAlign w:val="center"/>
+            <w:shd w:fill="FFFFFF"/>
+            <w:tcMar>
+              <w:top w:w="90" w:type="dxa"/>
+              <w:left w:w="90" w:type="dxa"/>
+              <w:bottom w:w="90" w:type="dxa"/>
+              <w:right w:w="90" w:type="dxa"/>
+            </w:tcMar>
+            <w:tcBorders>
+              <w:top w:val="single" w:sz="4" w:color="D9D9D9"/>
+              <w:left w:val="single" w:sz="4" w:color="D9D9D9"/>
+              <w:bottom w:val="single" w:sz="4" w:color="D9D9D9"/>
+              <w:right w:val="single" w:sz="4" w:color="D9D9D9"/>
+              <w:insideH w:val="single" w:sz="4" w:color="D9D9D9"/>
+              <w:insideV w:val="single" w:sz="4" w:color="D9D9D9"/>
+            </w:tcBorders>
+          </w:tcPr>
+          <w:p>
+            <w:pPr>
+              <w:spacing w:after="40" w:before="40"/>
+            </w:pPr>
+            <w:r>
+              <w:rPr>
+                <w:sz w:val="17"/>
+              </w:rPr>
+              <w:t>About 92% under that same measure.</w:t>
+            </w:r>
+          </w:p>
+        </w:tc>
+      </w:tr>
+      <w:tr>
+        <w:trPr>
+          <w:cantSplit/>
+        </w:trPr>
+        <w:tc>
+          <w:tcPr>
+            <w:tcW w:type="dxa" w:w="1728"/>
+            <w:vAlign w:val="center"/>
+            <w:shd w:fill="F6F9FC"/>
+            <w:tcMar>
+              <w:top w:w="90" w:type="dxa"/>
+              <w:left w:w="90" w:type="dxa"/>
+              <w:bottom w:w="90" w:type="dxa"/>
+              <w:right w:w="90" w:type="dxa"/>
+            </w:tcMar>
+            <w:tcBorders>
+              <w:top w:val="single" w:sz="4" w:color="D9D9D9"/>
+              <w:left w:val="single" w:sz="4" w:color="D9D9D9"/>
+              <w:bottom w:val="single" w:sz="4" w:color="D9D9D9"/>
+              <w:right w:val="single" w:sz="4" w:color="D9D9D9"/>
+              <w:insideH w:val="single" w:sz="4" w:color="D9D9D9"/>
+              <w:insideV w:val="single" w:sz="4" w:color="D9D9D9"/>
+            </w:tcBorders>
+          </w:tcPr>
+          <w:p>
+            <w:pPr>
+              <w:spacing w:after="40" w:before="40"/>
+            </w:pPr>
+            <w:r>
+              <w:rPr>
+                <w:sz w:val="17"/>
+              </w:rPr>
+              <w:t>MISO Zone 4</w:t>
+            </w:r>
+          </w:p>
+        </w:tc>
+        <w:tc>
+          <w:tcPr>
+            <w:tcW w:type="dxa" w:w="3672"/>
+            <w:vAlign w:val="center"/>
+            <w:shd w:fill="F6F9FC"/>
+            <w:tcMar>
+              <w:top w:w="90" w:type="dxa"/>
+              <w:left w:w="90" w:type="dxa"/>
+              <w:bottom w:w="90" w:type="dxa"/>
+              <w:right w:w="90" w:type="dxa"/>
+            </w:tcMar>
+            <w:tcBorders>
+              <w:top w:val="single" w:sz="4" w:color="D9D9D9"/>
+              <w:left w:val="single" w:sz="4" w:color="D9D9D9"/>
+              <w:bottom w:val="single" w:sz="4" w:color="D9D9D9"/>
+              <w:right w:val="single" w:sz="4" w:color="D9D9D9"/>
+              <w:insideH w:val="single" w:sz="4" w:color="D9D9D9"/>
+              <w:insideV w:val="single" w:sz="4" w:color="D9D9D9"/>
+            </w:tcBorders>
+          </w:tcPr>
+          <w:p>
+            <w:pPr>
+              <w:spacing w:after="40" w:before="40"/>
+            </w:pPr>
+            <w:r>
+              <w:rPr>
+                <w:sz w:val="17"/>
+              </w:rPr>
+              <w:t>Reliance on imported capacity rises over time.</w:t>
+            </w:r>
+          </w:p>
+        </w:tc>
+        <w:tc>
+          <w:tcPr>
+            <w:tcW w:type="dxa" w:w="3672"/>
+            <w:vAlign w:val="center"/>
+            <w:shd w:fill="F6F9FC"/>
+            <w:tcMar>
+              <w:top w:w="90" w:type="dxa"/>
+              <w:left w:w="90" w:type="dxa"/>
+              <w:bottom w:w="90" w:type="dxa"/>
+              <w:right w:w="90" w:type="dxa"/>
+            </w:tcMar>
+            <w:tcBorders>
+              <w:top w:val="single" w:sz="4" w:color="D9D9D9"/>
+              <w:left w:val="single" w:sz="4" w:color="D9D9D9"/>
+              <w:bottom w:val="single" w:sz="4" w:color="D9D9D9"/>
+              <w:right w:val="single" w:sz="4" w:color="D9D9D9"/>
+              <w:insideH w:val="single" w:sz="4" w:color="D9D9D9"/>
+              <w:insideV w:val="single" w:sz="4" w:color="D9D9D9"/>
+            </w:tcBorders>
+          </w:tcPr>
+          <w:p>
+            <w:pPr>
+              <w:spacing w:after="40" w:before="40"/>
+            </w:pPr>
+            <w:r>
+              <w:rPr>
+                <w:sz w:val="17"/>
+              </w:rPr>
+              <w:t>Imports still become more important over time, even with CEJA units available.</w:t>
+            </w:r>
+          </w:p>
+        </w:tc>
+      </w:tr>
+    </w:tbl>
+    <w:p>
+      <w:pPr>
+        <w:pStyle w:val="Heading3"/>
+        <w:keepNext/>
+        <w:keepLines/>
+      </w:pPr>
+      <w:r>
+        <w:t>What the results mean</w:t>
+      </w:r>
+    </w:p>
+    <w:p>
+      <w:pPr>
+        <w:keepLines/>
+      </w:pPr>
+      <w:r>
+        <w:t>In the Reference Case, Illinois reaches a higher share of clean generation but must have replacement capacity, storage, transmission, and imports ready when existing plants leave. In the Extension Case, existing units can supply dependable capacity and reduce some new builds, including new nuclear, long-duration storage, and imported capacity in the model. Neither case eliminates major resource growth. Statewide annual net exports also do not prove the Ameren Illinois zone has enough dependable capacity at its peak.</w:t>
+      </w:r>
+    </w:p>
+    <w:p>
+      <w:pPr>
+        <w:keepLines/>
+      </w:pPr>
+      <w:r>
+        <w:t>The 2045 percentages above refer to electricity generated within Illinois. They are not the share of firm capacity or a complete measure of electricity consumed by Illinois customers. The slides do not provide a plant-specific customer-bill result. The suggestion that extension might cost less needs the full cost assumptions and local impacts before it becomes a policy conclusion.</w:t>
+      </w:r>
+    </w:p>
+    <w:p>
+      <w:pPr>
+        <w:pStyle w:val="Heading3"/>
+        <w:keepNext/>
+        <w:keepLines/>
+      </w:pPr>
+      <w:r>
+        <w:t>What this means for Venice and the 2030 issue</w:t>
+      </w:r>
+    </w:p>
+    <w:p>
+      <w:pPr>
+        <w:keepLines/>
+      </w:pPr>
+      <w:r>
+        <w:t>The presentation did not recommend an extension for Venice. It separately described PJM requests for identified units totaling about 5.7 GW with 2030 retirement dates to remain online through 2031 for reliability. The appendix lists those PJM units; Venice is not among them and is in MISO. Do not treat that specific PJM development as approval of the broad CEJA Extension Case or as a precedent that automatically applies to an Ameren Missouri plant located in Illinois.</w:t>
+      </w:r>
+    </w:p>
+    <w:p>
+      <w:pPr>
+        <w:keepLines/>
+      </w:pPr>
+      <w:r>
+        <w:t>For Ameren Illinois customers, focus on MISO Zone 4: What dependable MW are needed in 2027 through 2030? Which imports are actually purchasable and deliverable? Which existing units can help, at what cost and emissions impact? How quickly can storage, demand response, transmission, and new generation provide comparable service? A credible plant case needs a defined reliability gap, a limited period, customer-cost analysis, environmental justice review, and a lawful mechanism.</w:t>
+      </w:r>
+    </w:p>
+    <w:p>
+      <w:pPr>
+        <w:pStyle w:val="Heading3"/>
+        <w:keepNext/>
+        <w:keepLines/>
+      </w:pPr>
+      <w:r>
+        <w:t>Policy judgment and political implications</w:t>
+      </w:r>
+    </w:p>
+    <w:p>
+      <w:pPr>
+        <w:keepLines/>
+      </w:pPr>
+      <w:r>
+        <w:t>Retiring on schedule offers a clearer path to lower in-state fossil generation, but it puts pressure on replacement delivery. Retaining units may bridge tight years and defer some new capacity, but it carries maintenance, fuel, emissions, and community costs. The workshop supports a narrow evidence-led discussion of options. It does not establish indefinite operation or settle the Venice question.</w:t>
+      </w:r>
+    </w:p>
+    <w:p>
+      <w:pPr>
+        <w:pStyle w:val="Heading3"/>
+        <w:keepNext/>
+        <w:keepLines/>
+      </w:pPr>
+      <w:r>
+        <w:t>Questions to ask before taking a position</w:t>
+      </w:r>
+    </w:p>
+    <w:p>
+      <w:pPr>
+        <w:pStyle w:val="ListBullet"/>
+        <w:keepLines/>
+      </w:pPr>
+      <w:r>
+        <w:t>What is the updated 2027–2030 Zone 4 capacity balance under higher load and delayed projects?</w:t>
+      </w:r>
+    </w:p>
+    <w:p>
+      <w:pPr>
+        <w:pStyle w:val="ListBullet"/>
+        <w:keepLines/>
+      </w:pPr>
+      <w:r>
+        <w:t>How were each plant’s accredited capacity, maintenance cost, emissions, and operating limits modeled?</w:t>
+      </w:r>
+    </w:p>
+    <w:p>
+      <w:pPr>
+        <w:pStyle w:val="ListBullet"/>
+        <w:keepLines/>
+      </w:pPr>
+      <w:r>
+        <w:t>How will out-of-state capacity be procured and delivered during regional stress?</w:t>
+      </w:r>
+    </w:p>
+    <w:p>
+      <w:pPr>
+        <w:pStyle w:val="ListBullet"/>
+        <w:keepLines/>
+      </w:pPr>
+      <w:r>
+        <w:t>How do customer bills and local environmental justice impacts compare across the alternatives?</w:t>
+      </w:r>
+    </w:p>
+    <w:p>
+      <w:pPr>
+        <w:pStyle w:val="ListBullet"/>
+        <w:keepLines/>
+      </w:pPr>
+      <w:r>
+        <w:t>Does the extension scenario’s treatment of unit and fleet emissions match plant-specific legal obligations?</w:t>
+      </w:r>
+    </w:p>
+    <w:p>
+      <w:pPr>
+        <w:pStyle w:val="Heading3"/>
+        <w:keepNext/>
+        <w:keepLines/>
+      </w:pPr>
+      <w:r>
+        <w:t>Plain-language debrief</w:t>
+      </w:r>
+    </w:p>
+    <w:p>
+      <w:pPr>
+        <w:keepLines/>
+      </w:pPr>
+      <w:r>
+        <w:t>“The workshop ran the planning model two ways. Under current CEJA retirement assumptions, Illinois has to replace dependable capacity as affected plants leave. When the model lets those plants stay available longer under emissions limits, it needs fewer replacement resources, even though the plants run relatively little. That matters for reliability, but it is not a decision about Venice. The next question is whether a particular plant provides a better short-term bridge once customer costs, local impacts, and realistic alternatives are compared.”</w:t>
+      </w:r>
+    </w:p>
+    <w:p>
+      <w:pPr>
+        <w:keepLines/>
+      </w:pPr>
+      <w:r>
+        <w:t>Official source: Illinois Power Agency, Stakeholder Workshop Draft Results, September 24, 2026, slides 9, 13, 17–23, 28, and 38. Workshop comments are due October 8. The initial IRP report is scheduled for November 16. Full presentation walk-through, Q&amp;A, and practice quiz: illinois-irp-workshop-2026.html in the Broderick Learning Hub.</w:t>
       </w:r>
     </w:p>
     <w:p>

</xml_diff>